<commit_message>
update thesis package with conference annex and osf draft
</commit_message>
<xml_diff>
--- a/appendices/appendix_f_conference_evidence.docx
+++ b/appendices/appendix_f_conference_evidence.docx
@@ -31,38 +31,46 @@
           <w:color w:val="000000"/>
           <w:sz w:val="24"/>
         </w:rPr>
-        <w:t>This annex is reserved for the conference certificate, conference program, or other official document confirming presentation of the thesis findings at a scientific conference, as required by LSU regulation clause 41.2.</w:t>
+        <w:t>Official conference certificate confirming presentation of the thesis findings, included in accordance with LSU regulation clause 41.2.</w:t>
       </w:r>
     </w:p>
     <w:p>
       <w:pPr>
-        <w:spacing w:line="360" w:lineRule="auto"/>
-        <w:jc w:val="both"/>
+        <w:jc w:val="center"/>
       </w:pPr>
       <w:r>
-        <w:rPr>
-          <w:rFonts w:ascii="Times New Roman" w:hAnsi="Times New Roman"/>
-          <w:b w:val="0"/>
-          <w:i w:val="0"/>
-          <w:color w:val="000000"/>
-          <w:sz w:val="24"/>
-        </w:rPr>
-      </w:r>
-    </w:p>
-    <w:p>
-      <w:pPr>
-        <w:spacing w:line="360" w:lineRule="auto"/>
-        <w:jc w:val="both"/>
-      </w:pPr>
-      <w:r>
-        <w:rPr>
-          <w:rFonts w:ascii="Times New Roman" w:hAnsi="Times New Roman"/>
-          <w:b/>
-          <w:i w:val="0"/>
-          <w:color w:val="000000"/>
-          <w:sz w:val="24"/>
-        </w:rPr>
-        <w:t>Insert the signed or official document in this annex before submission.</w:t>
+        <w:drawing>
+          <wp:inline xmlns:a="http://schemas.openxmlformats.org/drawingml/2006/main" xmlns:pic="http://schemas.openxmlformats.org/drawingml/2006/picture">
+            <wp:extent cx="5669280" cy="4009568"/>
+            <wp:docPr id="1" name="Picture 1"/>
+            <wp:cNvGraphicFramePr>
+              <a:graphicFrameLocks noChangeAspect="1"/>
+            </wp:cNvGraphicFramePr>
+            <a:graphic>
+              <a:graphicData uri="http://schemas.openxmlformats.org/drawingml/2006/picture">
+                <pic:pic>
+                  <pic:nvPicPr>
+                    <pic:cNvPr id="0" name="image.png"/>
+                    <pic:cNvPicPr/>
+                  </pic:nvPicPr>
+                  <pic:blipFill>
+                    <a:blip r:embed="rId9"/>
+                    <a:stretch>
+                      <a:fillRect/>
+                    </a:stretch>
+                  </pic:blipFill>
+                  <pic:spPr>
+                    <a:xfrm>
+                      <a:off x="0" y="0"/>
+                      <a:ext cx="5669280" cy="4009568"/>
+                    </a:xfrm>
+                    <a:prstGeom prst="rect"/>
+                  </pic:spPr>
+                </pic:pic>
+              </a:graphicData>
+            </a:graphic>
+          </wp:inline>
+        </w:drawing>
       </w:r>
     </w:p>
     <w:sectPr>

</xml_diff>